<commit_message>
Docx: append Section 14 documenting Run 5 (1.05B, 2.5K budget, MBPP target)
</commit_message>
<xml_diff>
--- a/analysis/EBT_Project_Details.docx
+++ b/analysis/EBT_Project_Details.docx
@@ -7891,6 +7891,1719 @@
       </w:pPr>
       <w:r>
         <w:t>Live W&amp;B run: wandb.ai/pkrajput/energy-coding-pretrain-small</w:t>
+      </w:r>
+    </w:p>
+    <w:p>
+      <w:r>
+        <w:br w:type="page"/>
+      </w:r>
+    </w:p>
+    <w:p>
+      <w:pPr>
+        <w:pStyle w:val="Heading1"/>
+      </w:pPr>
+      <w:r>
+        <w:rPr>
+          <w:color w:val="1F2A44"/>
+        </w:rPr>
+        <w:t>14. Run 5 (Approved by Advisor): 1.05B EBT with Code-Heavy SFT on $2.5K Budget</w:t>
+      </w:r>
+    </w:p>
+    <w:p>
+      <w:r>
+        <w:rPr>
+          <w:b w:val="0"/>
+        </w:rPr>
+        <w:t>After discussing the Run 3 / Run 4 results with the advisor, the project goal was sharpened: deliver a 1B+ EBT that achieves at least 5-10% on MBPP (HumanEval target dropped; achievable in this regime only with much larger pretraining budgets). Section 14 documents the budget analysis, model sizing decision, configuration, and tracking plan for the chosen approach. This supersedes the Path 2 plan in Section 11; Path 2 (full S2 recipe + FlashAttention) is now deferred to a future Phase C.</w:t>
+      </w:r>
+    </w:p>
+    <w:p>
+      <w:pPr>
+        <w:pStyle w:val="Heading2"/>
+      </w:pPr>
+      <w:r>
+        <w:rPr>
+          <w:color w:val="1F2A44"/>
+        </w:rPr>
+        <w:t>14.1 Budget Decision</w:t>
+      </w:r>
+    </w:p>
+    <w:p>
+      <w:r>
+        <w:rPr>
+          <w:b w:val="0"/>
+        </w:rPr>
+        <w:t>Hard cap: $2,500 total. Realistic allocation:</w:t>
+      </w:r>
+    </w:p>
+    <w:tbl>
+      <w:tblPr>
+        <w:tblStyle w:val="LightGrid-Accent1"/>
+        <w:tblW w:type="auto" w:w="0"/>
+        <w:tblLook w:firstColumn="1" w:firstRow="1" w:lastColumn="0" w:lastRow="0" w:noHBand="0" w:noVBand="1" w:val="04A0"/>
+      </w:tblPr>
+      <w:tblGrid>
+        <w:gridCol w:w="2493"/>
+        <w:gridCol w:w="2493"/>
+        <w:gridCol w:w="2493"/>
+        <w:gridCol w:w="2493"/>
+      </w:tblGrid>
+      <w:tr>
+        <w:tc>
+          <w:tcPr>
+            <w:tcW w:type="dxa" w:w="1417"/>
+          </w:tcPr>
+          <w:p>
+            <w:r/>
+            <w:r>
+              <w:rPr>
+                <w:b/>
+              </w:rPr>
+              <w:t>Phase</w:t>
+            </w:r>
+          </w:p>
+        </w:tc>
+        <w:tc>
+          <w:tcPr>
+            <w:tcW w:type="dxa" w:w="4252"/>
+          </w:tcPr>
+          <w:p>
+            <w:r/>
+            <w:r>
+              <w:rPr>
+                <w:b/>
+              </w:rPr>
+              <w:t>What</w:t>
+            </w:r>
+          </w:p>
+        </w:tc>
+        <w:tc>
+          <w:tcPr>
+            <w:tcW w:type="dxa" w:w="1701"/>
+          </w:tcPr>
+          <w:p>
+            <w:r/>
+            <w:r>
+              <w:rPr>
+                <w:b/>
+              </w:rPr>
+              <w:t>Hours @ $20/hr</w:t>
+            </w:r>
+          </w:p>
+        </w:tc>
+        <w:tc>
+          <w:tcPr>
+            <w:tcW w:type="dxa" w:w="1701"/>
+          </w:tcPr>
+          <w:p>
+            <w:r/>
+            <w:r>
+              <w:rPr>
+                <w:b/>
+              </w:rPr>
+              <w:t>Cost</w:t>
+            </w:r>
+          </w:p>
+        </w:tc>
+      </w:tr>
+      <w:tr>
+        <w:tc>
+          <w:tcPr>
+            <w:tcW w:type="dxa" w:w="1417"/>
+          </w:tcPr>
+          <w:p>
+            <w:r>
+              <w:rPr>
+                <w:sz w:val="20"/>
+              </w:rPr>
+              <w:t>A. Pretrain</w:t>
+            </w:r>
+          </w:p>
+        </w:tc>
+        <w:tc>
+          <w:tcPr>
+            <w:tcW w:type="dxa" w:w="4252"/>
+          </w:tcPr>
+          <w:p>
+            <w:r>
+              <w:rPr>
+                <w:sz w:val="20"/>
+              </w:rPr>
+              <w:t>1.05B EBT on ClimbMix to ~6B tokens</w:t>
+            </w:r>
+          </w:p>
+        </w:tc>
+        <w:tc>
+          <w:tcPr>
+            <w:tcW w:type="dxa" w:w="1701"/>
+          </w:tcPr>
+          <w:p>
+            <w:r>
+              <w:rPr>
+                <w:sz w:val="20"/>
+              </w:rPr>
+              <w:t>~85-95</w:t>
+            </w:r>
+          </w:p>
+        </w:tc>
+        <w:tc>
+          <w:tcPr>
+            <w:tcW w:type="dxa" w:w="1701"/>
+          </w:tcPr>
+          <w:p>
+            <w:r>
+              <w:rPr>
+                <w:sz w:val="20"/>
+              </w:rPr>
+              <w:t>~$1,700-1,900</w:t>
+            </w:r>
+          </w:p>
+        </w:tc>
+      </w:tr>
+      <w:tr>
+        <w:tc>
+          <w:tcPr>
+            <w:tcW w:type="dxa" w:w="1417"/>
+          </w:tcPr>
+          <w:p>
+            <w:r>
+              <w:rPr>
+                <w:sz w:val="20"/>
+              </w:rPr>
+              <w:t>B. SFT</w:t>
+            </w:r>
+          </w:p>
+        </w:tc>
+        <w:tc>
+          <w:tcPr>
+            <w:tcW w:type="dxa" w:w="4252"/>
+          </w:tcPr>
+          <w:p>
+            <w:r>
+              <w:rPr>
+                <w:sz w:val="20"/>
+              </w:rPr>
+              <w:t>Code-heavy mixture, 4000 max_steps</w:t>
+            </w:r>
+          </w:p>
+        </w:tc>
+        <w:tc>
+          <w:tcPr>
+            <w:tcW w:type="dxa" w:w="1701"/>
+          </w:tcPr>
+          <w:p>
+            <w:r>
+              <w:rPr>
+                <w:sz w:val="20"/>
+              </w:rPr>
+              <w:t>~17</w:t>
+            </w:r>
+          </w:p>
+        </w:tc>
+        <w:tc>
+          <w:tcPr>
+            <w:tcW w:type="dxa" w:w="1701"/>
+          </w:tcPr>
+          <w:p>
+            <w:r>
+              <w:rPr>
+                <w:sz w:val="20"/>
+              </w:rPr>
+              <w:t>~$340</w:t>
+            </w:r>
+          </w:p>
+        </w:tc>
+      </w:tr>
+      <w:tr>
+        <w:tc>
+          <w:tcPr>
+            <w:tcW w:type="dxa" w:w="1417"/>
+          </w:tcPr>
+          <w:p>
+            <w:r>
+              <w:rPr>
+                <w:sz w:val="20"/>
+              </w:rPr>
+              <w:t>Buffer</w:t>
+            </w:r>
+          </w:p>
+        </w:tc>
+        <w:tc>
+          <w:tcPr>
+            <w:tcW w:type="dxa" w:w="4252"/>
+          </w:tcPr>
+          <w:p>
+            <w:r>
+              <w:rPr>
+                <w:sz w:val="20"/>
+              </w:rPr>
+              <w:t>Setup + eval overhead + restart contingency</w:t>
+            </w:r>
+          </w:p>
+        </w:tc>
+        <w:tc>
+          <w:tcPr>
+            <w:tcW w:type="dxa" w:w="1701"/>
+          </w:tcPr>
+          <w:p>
+            <w:r>
+              <w:rPr>
+                <w:sz w:val="20"/>
+              </w:rPr>
+            </w:r>
+          </w:p>
+        </w:tc>
+        <w:tc>
+          <w:tcPr>
+            <w:tcW w:type="dxa" w:w="1701"/>
+          </w:tcPr>
+          <w:p>
+            <w:r>
+              <w:rPr>
+                <w:sz w:val="20"/>
+              </w:rPr>
+              <w:t>~$300-400</w:t>
+            </w:r>
+          </w:p>
+        </w:tc>
+      </w:tr>
+      <w:tr>
+        <w:tc>
+          <w:tcPr>
+            <w:tcW w:type="dxa" w:w="1417"/>
+          </w:tcPr>
+          <w:p>
+            <w:r>
+              <w:rPr>
+                <w:sz w:val="20"/>
+              </w:rPr>
+              <w:t>Total</w:t>
+            </w:r>
+          </w:p>
+        </w:tc>
+        <w:tc>
+          <w:tcPr>
+            <w:tcW w:type="dxa" w:w="4252"/>
+          </w:tcPr>
+          <w:p>
+            <w:r>
+              <w:rPr>
+                <w:sz w:val="20"/>
+              </w:rPr>
+            </w:r>
+          </w:p>
+        </w:tc>
+        <w:tc>
+          <w:tcPr>
+            <w:tcW w:type="dxa" w:w="1701"/>
+          </w:tcPr>
+          <w:p>
+            <w:r>
+              <w:rPr>
+                <w:sz w:val="20"/>
+              </w:rPr>
+            </w:r>
+          </w:p>
+        </w:tc>
+        <w:tc>
+          <w:tcPr>
+            <w:tcW w:type="dxa" w:w="1701"/>
+          </w:tcPr>
+          <w:p>
+            <w:r>
+              <w:rPr>
+                <w:sz w:val="20"/>
+              </w:rPr>
+              <w:t>~$2,300-2,500</w:t>
+            </w:r>
+          </w:p>
+        </w:tc>
+      </w:tr>
+    </w:tbl>
+    <w:p>
+      <w:pPr>
+        <w:pStyle w:val="Heading2"/>
+      </w:pPr>
+      <w:r>
+        <w:rPr>
+          <w:color w:val="1F2A44"/>
+        </w:rPr>
+        <w:t>14.2 Why 1.05B and not 1.3B</w:t>
+      </w:r>
+    </w:p>
+    <w:p>
+      <w:r>
+        <w:rPr>
+          <w:b w:val="0"/>
+        </w:rPr>
+        <w:t>The advisor preferred 1.3B; we negotiated down to 1.05B based on the token-budget math. At our estimated 12-16K tok/s on 4 x B200, a 1.3B model trained on the same $1700 pretraining budget would only see ~3B tokens (too undertrained for any meaningful code performance). The 1.05B option (20L x 16H x 2048E) fits ~5-6B tokens in the same budget, which gives a realistic shot at 10% MBPP post-SFT. The model architecture is still in the "GPT-Neo 1.3B / Pythia 1.4B family" - same head dim, same embedding width, fewer layers.</w:t>
+      </w:r>
+    </w:p>
+    <w:tbl>
+      <w:tblPr>
+        <w:tblStyle w:val="LightGrid-Accent1"/>
+        <w:tblW w:type="auto" w:w="0"/>
+        <w:tblLook w:firstColumn="1" w:firstRow="1" w:lastColumn="0" w:lastRow="0" w:noHBand="0" w:noVBand="1" w:val="04A0"/>
+      </w:tblPr>
+      <w:tblGrid>
+        <w:gridCol w:w="2493"/>
+        <w:gridCol w:w="2493"/>
+        <w:gridCol w:w="2493"/>
+        <w:gridCol w:w="2493"/>
+      </w:tblGrid>
+      <w:tr>
+        <w:tc>
+          <w:tcPr>
+            <w:tcW w:type="dxa" w:w="2551"/>
+          </w:tcPr>
+          <w:p>
+            <w:r/>
+            <w:r>
+              <w:rPr>
+                <w:b/>
+              </w:rPr>
+              <w:t>Param target</w:t>
+            </w:r>
+          </w:p>
+        </w:tc>
+        <w:tc>
+          <w:tcPr>
+            <w:tcW w:type="dxa" w:w="1701"/>
+          </w:tcPr>
+          <w:p>
+            <w:r/>
+            <w:r>
+              <w:rPr>
+                <w:b/>
+              </w:rPr>
+              <w:t>Tokens at $1.7K</w:t>
+            </w:r>
+          </w:p>
+        </w:tc>
+        <w:tc>
+          <w:tcPr>
+            <w:tcW w:type="dxa" w:w="2268"/>
+          </w:tcPr>
+          <w:p>
+            <w:r/>
+            <w:r>
+              <w:rPr>
+                <w:b/>
+              </w:rPr>
+              <w:t>MBPP pretrained</w:t>
+            </w:r>
+          </w:p>
+        </w:tc>
+        <w:tc>
+          <w:tcPr>
+            <w:tcW w:type="dxa" w:w="2551"/>
+          </w:tcPr>
+          <w:p>
+            <w:r/>
+            <w:r>
+              <w:rPr>
+                <w:b/>
+              </w:rPr>
+              <w:t>MBPP post-code-SFT</w:t>
+            </w:r>
+          </w:p>
+        </w:tc>
+      </w:tr>
+      <w:tr>
+        <w:tc>
+          <w:tcPr>
+            <w:tcW w:type="dxa" w:w="2551"/>
+          </w:tcPr>
+          <w:p>
+            <w:r>
+              <w:rPr>
+                <w:sz w:val="20"/>
+              </w:rPr>
+              <w:t>800M</w:t>
+            </w:r>
+          </w:p>
+        </w:tc>
+        <w:tc>
+          <w:tcPr>
+            <w:tcW w:type="dxa" w:w="1701"/>
+          </w:tcPr>
+          <w:p>
+            <w:r>
+              <w:rPr>
+                <w:sz w:val="20"/>
+              </w:rPr>
+              <w:t>~9B</w:t>
+            </w:r>
+          </w:p>
+        </w:tc>
+        <w:tc>
+          <w:tcPr>
+            <w:tcW w:type="dxa" w:w="2268"/>
+          </w:tcPr>
+          <w:p>
+            <w:r>
+              <w:rPr>
+                <w:sz w:val="20"/>
+              </w:rPr>
+              <w:t>4-7%</w:t>
+            </w:r>
+          </w:p>
+        </w:tc>
+        <w:tc>
+          <w:tcPr>
+            <w:tcW w:type="dxa" w:w="2551"/>
+          </w:tcPr>
+          <w:p>
+            <w:r>
+              <w:rPr>
+                <w:sz w:val="20"/>
+              </w:rPr>
+              <w:t>7-10%</w:t>
+            </w:r>
+          </w:p>
+        </w:tc>
+      </w:tr>
+      <w:tr>
+        <w:tc>
+          <w:tcPr>
+            <w:tcW w:type="dxa" w:w="2551"/>
+          </w:tcPr>
+          <w:p>
+            <w:r>
+              <w:rPr>
+                <w:sz w:val="20"/>
+              </w:rPr>
+              <w:t>1.05B (chosen)</w:t>
+            </w:r>
+          </w:p>
+        </w:tc>
+        <w:tc>
+          <w:tcPr>
+            <w:tcW w:type="dxa" w:w="1701"/>
+          </w:tcPr>
+          <w:p>
+            <w:r>
+              <w:rPr>
+                <w:sz w:val="20"/>
+              </w:rPr>
+              <w:t>~5-6B</w:t>
+            </w:r>
+          </w:p>
+        </w:tc>
+        <w:tc>
+          <w:tcPr>
+            <w:tcW w:type="dxa" w:w="2268"/>
+          </w:tcPr>
+          <w:p>
+            <w:r>
+              <w:rPr>
+                <w:sz w:val="20"/>
+              </w:rPr>
+              <w:t>5-7%</w:t>
+            </w:r>
+          </w:p>
+        </w:tc>
+        <w:tc>
+          <w:tcPr>
+            <w:tcW w:type="dxa" w:w="2551"/>
+          </w:tcPr>
+          <w:p>
+            <w:r>
+              <w:rPr>
+                <w:sz w:val="20"/>
+              </w:rPr>
+              <w:t>7-10% (target zone)</w:t>
+            </w:r>
+          </w:p>
+        </w:tc>
+      </w:tr>
+      <w:tr>
+        <w:tc>
+          <w:tcPr>
+            <w:tcW w:type="dxa" w:w="2551"/>
+          </w:tcPr>
+          <w:p>
+            <w:r>
+              <w:rPr>
+                <w:sz w:val="20"/>
+              </w:rPr>
+              <w:t>1.3B (advisor preference)</w:t>
+            </w:r>
+          </w:p>
+        </w:tc>
+        <w:tc>
+          <w:tcPr>
+            <w:tcW w:type="dxa" w:w="1701"/>
+          </w:tcPr>
+          <w:p>
+            <w:r>
+              <w:rPr>
+                <w:sz w:val="20"/>
+              </w:rPr>
+              <w:t>~3-4B</w:t>
+            </w:r>
+          </w:p>
+        </w:tc>
+        <w:tc>
+          <w:tcPr>
+            <w:tcW w:type="dxa" w:w="2268"/>
+          </w:tcPr>
+          <w:p>
+            <w:r>
+              <w:rPr>
+                <w:sz w:val="20"/>
+              </w:rPr>
+              <w:t>3-5%</w:t>
+            </w:r>
+          </w:p>
+        </w:tc>
+        <w:tc>
+          <w:tcPr>
+            <w:tcW w:type="dxa" w:w="2551"/>
+          </w:tcPr>
+          <w:p>
+            <w:r>
+              <w:rPr>
+                <w:sz w:val="20"/>
+              </w:rPr>
+              <w:t>5-8% (likely undershoot)</w:t>
+            </w:r>
+          </w:p>
+        </w:tc>
+      </w:tr>
+    </w:tbl>
+    <w:p>
+      <w:pPr>
+        <w:pStyle w:val="Heading2"/>
+      </w:pPr>
+      <w:r>
+        <w:rPr>
+          <w:color w:val="1F2A44"/>
+        </w:rPr>
+        <w:t>14.3 Why Relaxed S2 (not Full S2)</w:t>
+      </w:r>
+    </w:p>
+    <w:p>
+      <w:r>
+        <w:rPr>
+          <w:b w:val="0"/>
+        </w:rPr>
+        <w:t>Section 10 already documented why the relaxed S2 recipe limits the energy-descent story. We accept this trade-off for Run 5 because:</w:t>
+      </w:r>
+    </w:p>
+    <w:p>
+      <w:pPr>
+        <w:pStyle w:val="ListBullet"/>
+      </w:pPr>
+      <w:r>
+        <w:rPr>
+          <w:b/>
+        </w:rPr>
+        <w:t>Memory math:</w:t>
+      </w:r>
+      <w:r>
+        <w:t xml:space="preserve"> Full S2 recipe at 1.05B (no_mcmc_detach=True, 4 sweeps stored) requires ~250 GB per GPU at seq=1024 bs=2, OOMing on B200 (178 GB).</w:t>
+      </w:r>
+    </w:p>
+    <w:p>
+      <w:pPr>
+        <w:pStyle w:val="ListBullet"/>
+      </w:pPr>
+      <w:r>
+        <w:rPr>
+          <w:b/>
+        </w:rPr>
+        <w:t>Engineering scope:</w:t>
+      </w:r>
+      <w:r>
+        <w:t xml:space="preserve"> FlashAttention surgery in EBT/model/ar_ebt_time_embed.py is needed to fit full S2 at 1B+; estimated 1-2 days. Out of scope for Run 5's budget.</w:t>
+      </w:r>
+    </w:p>
+    <w:p>
+      <w:pPr>
+        <w:pStyle w:val="ListBullet"/>
+      </w:pPr>
+      <w:r>
+        <w:rPr>
+          <w:b/>
+        </w:rPr>
+        <w:t>Goal prioritization:</w:t>
+      </w:r>
+      <w:r>
+        <w:t xml:space="preserve"> Run 5 prioritizes CODE PERFORMANCE (MBPP target) over THINKING-SCALING DEMONSTRATION (paper claim). Full S2 + FA can come in a follow-up Phase C run once Run 5 validates the base pipeline at scale.</w:t>
+      </w:r>
+    </w:p>
+    <w:p>
+      <w:pPr>
+        <w:pStyle w:val="ListBullet"/>
+      </w:pPr>
+      <w:r>
+        <w:rPr>
+          <w:b/>
+        </w:rPr>
+        <w:t>What we keep:</w:t>
+      </w:r>
+      <w:r>
+        <w:t xml:space="preserve"> mcmc_num_steps=4 (so time_embeddings table is the right size for the multi-depth CORE eval), all other paper-faithful regularizers (random alpha, random num steps, Langevin noise, replay buffer, norm_pred, scale_alpha_with_energy). Only no_mcmc_detach is disabled.</w:t>
+      </w:r>
+    </w:p>
+    <w:p>
+      <w:pPr>
+        <w:pStyle w:val="Heading2"/>
+      </w:pPr>
+      <w:r>
+        <w:rPr>
+          <w:color w:val="1F2A44"/>
+        </w:rPr>
+        <w:t>14.4 New Tracking: MBPP Pass@1</w:t>
+      </w:r>
+    </w:p>
+    <w:p>
+      <w:r>
+        <w:rPr>
+          <w:b w:val="0"/>
+        </w:rPr>
+        <w:t>MBPP is now tracked alongside HumanEval throughout pretraining and SFT. Implementation in src/energy_coding/evaluation.py::evaluate_mbpp:</w:t>
+      </w:r>
+    </w:p>
+    <w:p>
+      <w:pPr>
+        <w:pStyle w:val="ListBullet"/>
+      </w:pPr>
+      <w:r>
+        <w:rPr>
+          <w:b/>
+        </w:rPr>
+        <w:t>Dataset:</w:t>
+      </w:r>
+      <w:r>
+        <w:t xml:space="preserve"> google-research-datasets/mbpp config="sanitized" split="test" (curated 257 problems with cleaner test cases than the raw 974).</w:t>
+      </w:r>
+    </w:p>
+    <w:p>
+      <w:pPr>
+        <w:pStyle w:val="ListBullet"/>
+      </w:pPr>
+      <w:r>
+        <w:rPr>
+          <w:b/>
+        </w:rPr>
+        <w:t>Prompt format:</w:t>
+      </w:r>
+      <w:r>
+        <w:t xml:space="preserve"> Standard MBPP-pack style: problem description + ONE assertion as a hint + "```python\n" opener (nudges the model into code-completion mode rather than free-form prose).</w:t>
+      </w:r>
+    </w:p>
+    <w:p>
+      <w:pPr>
+        <w:pStyle w:val="ListBullet"/>
+      </w:pPr>
+      <w:r>
+        <w:rPr>
+          <w:b/>
+        </w:rPr>
+        <w:t>Execution:</w:t>
+      </w:r>
+      <w:r>
+        <w:t xml:space="preserve"> Same nanochat.execution.execute_code sandbox as HumanEval, 8s timeout. We run the model's extracted code against the full test_list[] for each problem.</w:t>
+      </w:r>
+    </w:p>
+    <w:p>
+      <w:pPr>
+        <w:pStyle w:val="ListBullet"/>
+      </w:pPr>
+      <w:r>
+        <w:rPr>
+          <w:b/>
+        </w:rPr>
+        <w:t>BoN self-verification:</w:t>
+      </w:r>
+      <w:r>
+        <w:t xml:space="preserve"> Optional mbpp_self_verify_samples (default 1). When &gt; 1, generates K candidates and picks the one with lowest mean final-step energy.</w:t>
+      </w:r>
+    </w:p>
+    <w:p>
+      <w:pPr>
+        <w:pStyle w:val="ListBullet"/>
+      </w:pPr>
+      <w:r>
+        <w:rPr>
+          <w:b/>
+        </w:rPr>
+        <w:t>Logged metrics:</w:t>
+      </w:r>
+      <w:r>
+        <w:t xml:space="preserve"> mbpp_pass_at_1, mbpp_pass_at_1_bon, mbpp_pass_at_n, mbpp_passed, mbpp_passed_bon, mbpp_total, mbpp_self_verify_samples.</w:t>
+      </w:r>
+    </w:p>
+    <w:p>
+      <w:pPr>
+        <w:pStyle w:val="ListBullet"/>
+      </w:pPr>
+      <w:r>
+        <w:rPr>
+          <w:b/>
+        </w:rPr>
+        <w:t>Default cadence in Run 5:</w:t>
+      </w:r>
+      <w:r>
+        <w:t xml:space="preserve"> mbpp_interval=2000 (same as humaneval_interval), mbpp_max_problems=32 to keep eval cost ~40 minutes per call.</w:t>
+      </w:r>
+    </w:p>
+    <w:p>
+      <w:pPr>
+        <w:pStyle w:val="Heading2"/>
+      </w:pPr>
+      <w:r>
+        <w:rPr>
+          <w:color w:val="1F2A44"/>
+        </w:rPr>
+        <w:t>14.5 SFT Mixture Re-Weighted Toward Code</w:t>
+      </w:r>
+    </w:p>
+    <w:p>
+      <w:r>
+        <w:rPr>
+          <w:b w:val="0"/>
+        </w:rPr>
+        <w:t>src/energy_coding/data.py default per-source caps changed:</w:t>
+      </w:r>
+    </w:p>
+    <w:tbl>
+      <w:tblPr>
+        <w:tblStyle w:val="LightGrid-Accent1"/>
+        <w:tblW w:type="auto" w:w="0"/>
+        <w:tblLook w:firstColumn="1" w:firstRow="1" w:lastColumn="0" w:lastRow="0" w:noHBand="0" w:noVBand="1" w:val="04A0"/>
+      </w:tblPr>
+      <w:tblGrid>
+        <w:gridCol w:w="2493"/>
+        <w:gridCol w:w="2493"/>
+        <w:gridCol w:w="2493"/>
+        <w:gridCol w:w="2493"/>
+      </w:tblGrid>
+      <w:tr>
+        <w:tc>
+          <w:tcPr>
+            <w:tcW w:type="dxa" w:w="2835"/>
+          </w:tcPr>
+          <w:p>
+            <w:r/>
+            <w:r>
+              <w:rPr>
+                <w:b/>
+              </w:rPr>
+              <w:t>Source</w:t>
+            </w:r>
+          </w:p>
+        </w:tc>
+        <w:tc>
+          <w:tcPr>
+            <w:tcW w:type="dxa" w:w="1417"/>
+          </w:tcPr>
+          <w:p>
+            <w:r/>
+            <w:r>
+              <w:rPr>
+                <w:b/>
+              </w:rPr>
+              <w:t>Old cap</w:t>
+            </w:r>
+          </w:p>
+        </w:tc>
+        <w:tc>
+          <w:tcPr>
+            <w:tcW w:type="dxa" w:w="1417"/>
+          </w:tcPr>
+          <w:p>
+            <w:r/>
+            <w:r>
+              <w:rPr>
+                <w:b/>
+              </w:rPr>
+              <w:t>New cap</w:t>
+            </w:r>
+          </w:p>
+        </w:tc>
+        <w:tc>
+          <w:tcPr>
+            <w:tcW w:type="dxa" w:w="3402"/>
+          </w:tcPr>
+          <w:p>
+            <w:r/>
+            <w:r>
+              <w:rPr>
+                <w:b/>
+              </w:rPr>
+              <w:t>Reason</w:t>
+            </w:r>
+          </w:p>
+        </w:tc>
+      </w:tr>
+      <w:tr>
+        <w:tc>
+          <w:tcPr>
+            <w:tcW w:type="dxa" w:w="2835"/>
+          </w:tcPr>
+          <w:p>
+            <w:r>
+              <w:rPr>
+                <w:sz w:val="20"/>
+              </w:rPr>
+              <w:t>HuggingFaceTB/smoltalk</w:t>
+            </w:r>
+          </w:p>
+        </w:tc>
+        <w:tc>
+          <w:tcPr>
+            <w:tcW w:type="dxa" w:w="1417"/>
+          </w:tcPr>
+          <w:p>
+            <w:r>
+              <w:rPr>
+                <w:sz w:val="20"/>
+              </w:rPr>
+              <w:t>460,000</w:t>
+            </w:r>
+          </w:p>
+        </w:tc>
+        <w:tc>
+          <w:tcPr>
+            <w:tcW w:type="dxa" w:w="1417"/>
+          </w:tcPr>
+          <w:p>
+            <w:r>
+              <w:rPr>
+                <w:sz w:val="20"/>
+              </w:rPr>
+              <w:t>250,000</w:t>
+            </w:r>
+          </w:p>
+        </w:tc>
+        <w:tc>
+          <w:tcPr>
+            <w:tcW w:type="dxa" w:w="3402"/>
+          </w:tcPr>
+          <w:p>
+            <w:r>
+              <w:rPr>
+                <w:sz w:val="20"/>
+              </w:rPr>
+              <w:t>Reduce general chat dominance</w:t>
+            </w:r>
+          </w:p>
+        </w:tc>
+      </w:tr>
+      <w:tr>
+        <w:tc>
+          <w:tcPr>
+            <w:tcW w:type="dxa" w:w="2835"/>
+          </w:tcPr>
+          <w:p>
+            <w:r>
+              <w:rPr>
+                <w:sz w:val="20"/>
+              </w:rPr>
+              <w:t>cais/mmlu (auxiliary)</w:t>
+            </w:r>
+          </w:p>
+        </w:tc>
+        <w:tc>
+          <w:tcPr>
+            <w:tcW w:type="dxa" w:w="1417"/>
+          </w:tcPr>
+          <w:p>
+            <w:r>
+              <w:rPr>
+                <w:sz w:val="20"/>
+              </w:rPr>
+              <w:t>100,000</w:t>
+            </w:r>
+          </w:p>
+        </w:tc>
+        <w:tc>
+          <w:tcPr>
+            <w:tcW w:type="dxa" w:w="1417"/>
+          </w:tcPr>
+          <w:p>
+            <w:r>
+              <w:rPr>
+                <w:sz w:val="20"/>
+              </w:rPr>
+              <w:t>60,000</w:t>
+            </w:r>
+          </w:p>
+        </w:tc>
+        <w:tc>
+          <w:tcPr>
+            <w:tcW w:type="dxa" w:w="3402"/>
+          </w:tcPr>
+          <w:p>
+            <w:r>
+              <w:rPr>
+                <w:sz w:val="20"/>
+              </w:rPr>
+              <w:t>Reduce MC weighting</w:t>
+            </w:r>
+          </w:p>
+        </w:tc>
+      </w:tr>
+      <w:tr>
+        <w:tc>
+          <w:tcPr>
+            <w:tcW w:type="dxa" w:w="2835"/>
+          </w:tcPr>
+          <w:p>
+            <w:r>
+              <w:rPr>
+                <w:sz w:val="20"/>
+              </w:rPr>
+              <w:t>openai/gsm8k</w:t>
+            </w:r>
+          </w:p>
+        </w:tc>
+        <w:tc>
+          <w:tcPr>
+            <w:tcW w:type="dxa" w:w="1417"/>
+          </w:tcPr>
+          <w:p>
+            <w:r>
+              <w:rPr>
+                <w:sz w:val="20"/>
+              </w:rPr>
+              <w:t>8,000</w:t>
+            </w:r>
+          </w:p>
+        </w:tc>
+        <w:tc>
+          <w:tcPr>
+            <w:tcW w:type="dxa" w:w="1417"/>
+          </w:tcPr>
+          <w:p>
+            <w:r>
+              <w:rPr>
+                <w:sz w:val="20"/>
+              </w:rPr>
+              <w:t>8,000</w:t>
+            </w:r>
+          </w:p>
+        </w:tc>
+        <w:tc>
+          <w:tcPr>
+            <w:tcW w:type="dxa" w:w="3402"/>
+          </w:tcPr>
+          <w:p>
+            <w:r>
+              <w:rPr>
+                <w:sz w:val="20"/>
+              </w:rPr>
+              <w:t>unchanged</w:t>
+            </w:r>
+          </w:p>
+        </w:tc>
+      </w:tr>
+      <w:tr>
+        <w:tc>
+          <w:tcPr>
+            <w:tcW w:type="dxa" w:w="2835"/>
+          </w:tcPr>
+          <w:p>
+            <w:r>
+              <w:rPr>
+                <w:sz w:val="20"/>
+              </w:rPr>
+              <w:t>sahil2801/CodeAlpaca-20k</w:t>
+            </w:r>
+          </w:p>
+        </w:tc>
+        <w:tc>
+          <w:tcPr>
+            <w:tcW w:type="dxa" w:w="1417"/>
+          </w:tcPr>
+          <w:p>
+            <w:r>
+              <w:rPr>
+                <w:sz w:val="20"/>
+              </w:rPr>
+              <w:t>20,000</w:t>
+            </w:r>
+          </w:p>
+        </w:tc>
+        <w:tc>
+          <w:tcPr>
+            <w:tcW w:type="dxa" w:w="1417"/>
+          </w:tcPr>
+          <w:p>
+            <w:r>
+              <w:rPr>
+                <w:sz w:val="20"/>
+              </w:rPr>
+              <w:t>20,000</w:t>
+            </w:r>
+          </w:p>
+        </w:tc>
+        <w:tc>
+          <w:tcPr>
+            <w:tcW w:type="dxa" w:w="3402"/>
+          </w:tcPr>
+          <w:p>
+            <w:r>
+              <w:rPr>
+                <w:sz w:val="20"/>
+              </w:rPr>
+              <w:t>unchanged</w:t>
+            </w:r>
+          </w:p>
+        </w:tc>
+      </w:tr>
+      <w:tr>
+        <w:tc>
+          <w:tcPr>
+            <w:tcW w:type="dxa" w:w="2835"/>
+          </w:tcPr>
+          <w:p>
+            <w:r>
+              <w:rPr>
+                <w:sz w:val="20"/>
+              </w:rPr>
+              <w:t>google-research-datasets/mbpp</w:t>
+            </w:r>
+          </w:p>
+        </w:tc>
+        <w:tc>
+          <w:tcPr>
+            <w:tcW w:type="dxa" w:w="1417"/>
+          </w:tcPr>
+          <w:p>
+            <w:r>
+              <w:rPr>
+                <w:sz w:val="20"/>
+              </w:rPr>
+              <w:t>974</w:t>
+            </w:r>
+          </w:p>
+        </w:tc>
+        <w:tc>
+          <w:tcPr>
+            <w:tcW w:type="dxa" w:w="1417"/>
+          </w:tcPr>
+          <w:p>
+            <w:r>
+              <w:rPr>
+                <w:sz w:val="20"/>
+              </w:rPr>
+              <w:t>974</w:t>
+            </w:r>
+          </w:p>
+        </w:tc>
+        <w:tc>
+          <w:tcPr>
+            <w:tcW w:type="dxa" w:w="3402"/>
+          </w:tcPr>
+          <w:p>
+            <w:r>
+              <w:rPr>
+                <w:sz w:val="20"/>
+              </w:rPr>
+              <w:t>unchanged (small dataset)</w:t>
+            </w:r>
+          </w:p>
+        </w:tc>
+      </w:tr>
+      <w:tr>
+        <w:tc>
+          <w:tcPr>
+            <w:tcW w:type="dxa" w:w="2835"/>
+          </w:tcPr>
+          <w:p>
+            <w:r>
+              <w:rPr>
+                <w:sz w:val="20"/>
+              </w:rPr>
+              <w:t>nvidia/OpenCodeReasoning</w:t>
+            </w:r>
+          </w:p>
+        </w:tc>
+        <w:tc>
+          <w:tcPr>
+            <w:tcW w:type="dxa" w:w="1417"/>
+          </w:tcPr>
+          <w:p>
+            <w:r>
+              <w:rPr>
+                <w:sz w:val="20"/>
+              </w:rPr>
+              <w:t>25,000</w:t>
+            </w:r>
+          </w:p>
+        </w:tc>
+        <w:tc>
+          <w:tcPr>
+            <w:tcW w:type="dxa" w:w="1417"/>
+          </w:tcPr>
+          <w:p>
+            <w:r>
+              <w:rPr>
+                <w:sz w:val="20"/>
+              </w:rPr>
+              <w:t>80,000</w:t>
+            </w:r>
+          </w:p>
+        </w:tc>
+        <w:tc>
+          <w:tcPr>
+            <w:tcW w:type="dxa" w:w="3402"/>
+          </w:tcPr>
+          <w:p>
+            <w:r>
+              <w:rPr>
+                <w:sz w:val="20"/>
+              </w:rPr>
+              <w:t>Boost code reasoning signal</w:t>
+            </w:r>
+          </w:p>
+        </w:tc>
+      </w:tr>
+    </w:tbl>
+    <w:p>
+      <w:r>
+        <w:rPr>
+          <w:b w:val="0"/>
+        </w:rPr>
+        <w:t>Resulting mix: ~420K examples total, ~35-40% code-related (CodeAlpaca + MBPP + OpenCodeReasoning). MBPP train_examples will be seen ~5-6x per epoch during SFT, which is intentional - we want the model to learn the MBPP-style problem-solution format the eval uses.</w:t>
+      </w:r>
+    </w:p>
+    <w:p>
+      <w:pPr>
+        <w:pStyle w:val="Heading2"/>
+      </w:pPr>
+      <w:r>
+        <w:rPr>
+          <w:color w:val="1F2A44"/>
+        </w:rPr>
+        <w:t>14.6 Hardware Configuration</w:t>
+      </w:r>
+    </w:p>
+    <w:p>
+      <w:r>
+        <w:rPr>
+          <w:b w:val="0"/>
+        </w:rPr>
+        <w:t>Target: 4x NVIDIA B200 SXM (178 GB HBM3e each) at ~$20/hr.</w:t>
+      </w:r>
+    </w:p>
+    <w:p>
+      <w:pPr>
+        <w:spacing w:after="120"/>
+        <w:ind w:left="283"/>
+        <w:shd w:val="clear" w:color="auto" w:fill="F2F2F2"/>
+      </w:pPr>
+      <w:r>
+        <w:rPr>
+          <w:rFonts w:ascii="Menlo" w:hAnsi="Menlo"/>
+          <w:sz w:val="19"/>
+        </w:rPr>
+        <w:t>configs/ebt_1b_climbmix_4xb200.json:</w:t>
+        <w:br/>
+        <w:t xml:space="preserve">  data.sequence_length              = 1024</w:t>
+        <w:br/>
+        <w:t xml:space="preserve">  model.num_transformer_blocks      = 20</w:t>
+        <w:br/>
+        <w:t xml:space="preserve">  model.multiheaded_attention_heads = 16</w:t>
+        <w:br/>
+        <w:t xml:space="preserve">  model.embedding_dim               = 2048</w:t>
+        <w:br/>
+        <w:t xml:space="preserve">  model.mcmc_num_steps              = 4       # supports clean depth-scaling eval</w:t>
+        <w:br/>
+        <w:t xml:space="preserve">  model.no_mcmc_detach              = false   # memory budget</w:t>
+        <w:br/>
+        <w:t xml:space="preserve">  model.mcmc_replay_buffer          = true</w:t>
+        <w:br/>
+        <w:t xml:space="preserve">  model.mcmc_step_size_learnable    = true</w:t>
+        <w:br/>
+        <w:t xml:space="preserve">  optim.learning_rate               = 3e-4</w:t>
+        <w:br/>
+        <w:t xml:space="preserve">  optim.warmup_steps                = 1500</w:t>
+        <w:br/>
+        <w:t xml:space="preserve">  optim.warmdown_ratio              = 0.5</w:t>
+        <w:br/>
+        <w:t xml:space="preserve">  train.device_batch_size           = 4</w:t>
+        <w:br/>
+        <w:t xml:space="preserve">  train.gradient_accumulation_steps = 32</w:t>
+        <w:br/>
+        <w:t xml:space="preserve">  train.precision                   = bf16</w:t>
+        <w:br/>
+        <w:t xml:space="preserve">  train.compile_model               = false</w:t>
+        <w:br/>
+        <w:t xml:space="preserve">  train.target_tokens               = 6,000,000,000</w:t>
+        <w:br/>
+        <w:t xml:space="preserve">  train.minimum_tokens_before_stop  = 4,000,000,000</w:t>
+        <w:br/>
+        <w:t xml:space="preserve">  train.loss_patience_steps         = 2000</w:t>
+        <w:br/>
+        <w:t xml:space="preserve">  train.core_eval_interval          = 1000</w:t>
+        <w:br/>
+        <w:t xml:space="preserve">  train.humaneval_interval          = 2000</w:t>
+        <w:br/>
+        <w:t xml:space="preserve">  train.mbpp_interval               = 2000      # NEW</w:t>
+        <w:br/>
+        <w:t xml:space="preserve">  train.mbpp_max_problems           = 32        # NEW</w:t>
+        <w:br/>
+        <w:t xml:space="preserve">  train.mbpp_max_new_tokens         = 192       # NEW</w:t>
+        <w:br/>
+        <w:br/>
+        <w:t xml:space="preserve">  -&gt; 524,288 tokens / optimizer step (same schedule as small runs)</w:t>
+        <w:br/>
+      </w:r>
+    </w:p>
+    <w:p>
+      <w:r>
+        <w:rPr>
+          <w:b w:val="0"/>
+        </w:rPr>
+        <w:t>Memory analysis at 1.05B + seq=1024 + bs=4 with relaxed S2 on B200 (178 GB):</w:t>
+      </w:r>
+    </w:p>
+    <w:p>
+      <w:pPr>
+        <w:spacing w:after="120"/>
+        <w:ind w:left="283"/>
+        <w:shd w:val="clear" w:color="auto" w:fill="F2F2F2"/>
+      </w:pPr>
+      <w:r>
+        <w:rPr>
+          <w:rFonts w:ascii="Menlo" w:hAnsi="Menlo"/>
+          <w:sz w:val="19"/>
+        </w:rPr>
+        <w:t>per-layer attention activation (bf16):</w:t>
+        <w:br/>
+        <w:t xml:space="preserve">  4 * 16 * 2048^2 * 2 = 0.5 GB</w:t>
+        <w:br/>
+        <w:t xml:space="preserve">  x 20 layers = 10 GB</w:t>
+        <w:br/>
+        <w:t>+ Hessian factor on final sweep (create_graph=True): +10 GB = 20 GB</w:t>
+        <w:br/>
+        <w:t>+ model + optimizer (1.05B * 8 bytes): ~8 GB</w:t>
+        <w:br/>
+        <w:t>+ FFN activations + replay buffer + slack: ~10 GB</w:t>
+        <w:br/>
+        <w:t>= ~48 GB peak per GPU      [comfortable on 178 GB B200]</w:t>
+        <w:br/>
+      </w:r>
+    </w:p>
+    <w:p>
+      <w:pPr>
+        <w:pStyle w:val="Heading2"/>
+      </w:pPr>
+      <w:r>
+        <w:rPr>
+          <w:color w:val="1F2A44"/>
+        </w:rPr>
+        <w:t>14.7 Phased Roadmap</w:t>
+      </w:r>
+    </w:p>
+    <w:tbl>
+      <w:tblPr>
+        <w:tblStyle w:val="LightGrid-Accent1"/>
+        <w:tblW w:type="auto" w:w="0"/>
+        <w:tblLook w:firstColumn="1" w:firstRow="1" w:lastColumn="0" w:lastRow="0" w:noHBand="0" w:noVBand="1" w:val="04A0"/>
+      </w:tblPr>
+      <w:tblGrid>
+        <w:gridCol w:w="2493"/>
+        <w:gridCol w:w="2493"/>
+        <w:gridCol w:w="2493"/>
+        <w:gridCol w:w="2493"/>
+      </w:tblGrid>
+      <w:tr>
+        <w:tc>
+          <w:tcPr>
+            <w:tcW w:type="dxa" w:w="1984"/>
+          </w:tcPr>
+          <w:p>
+            <w:r/>
+            <w:r>
+              <w:rPr>
+                <w:b/>
+              </w:rPr>
+              <w:t>Phase</w:t>
+            </w:r>
+          </w:p>
+        </w:tc>
+        <w:tc>
+          <w:tcPr>
+            <w:tcW w:type="dxa" w:w="1984"/>
+          </w:tcPr>
+          <w:p>
+            <w:r/>
+            <w:r>
+              <w:rPr>
+                <w:b/>
+              </w:rPr>
+              <w:t>Status</w:t>
+            </w:r>
+          </w:p>
+        </w:tc>
+        <w:tc>
+          <w:tcPr>
+            <w:tcW w:type="dxa" w:w="3402"/>
+          </w:tcPr>
+          <w:p>
+            <w:r/>
+            <w:r>
+              <w:rPr>
+                <w:b/>
+              </w:rPr>
+              <w:t>What</w:t>
+            </w:r>
+          </w:p>
+        </w:tc>
+        <w:tc>
+          <w:tcPr>
+            <w:tcW w:type="dxa" w:w="1701"/>
+          </w:tcPr>
+          <w:p>
+            <w:r/>
+            <w:r>
+              <w:rPr>
+                <w:b/>
+              </w:rPr>
+              <w:t>Cost</w:t>
+            </w:r>
+          </w:p>
+        </w:tc>
+      </w:tr>
+      <w:tr>
+        <w:tc>
+          <w:tcPr>
+            <w:tcW w:type="dxa" w:w="1984"/>
+          </w:tcPr>
+          <w:p>
+            <w:r>
+              <w:rPr>
+                <w:sz w:val="20"/>
+              </w:rPr>
+              <w:t>A. Pretrain</w:t>
+            </w:r>
+          </w:p>
+        </w:tc>
+        <w:tc>
+          <w:tcPr>
+            <w:tcW w:type="dxa" w:w="1984"/>
+          </w:tcPr>
+          <w:p>
+            <w:r>
+              <w:rPr>
+                <w:sz w:val="20"/>
+              </w:rPr>
+              <w:t>config ready, awaits new B200 box</w:t>
+            </w:r>
+          </w:p>
+        </w:tc>
+        <w:tc>
+          <w:tcPr>
+            <w:tcW w:type="dxa" w:w="3402"/>
+          </w:tcPr>
+          <w:p>
+            <w:r>
+              <w:rPr>
+                <w:sz w:val="20"/>
+              </w:rPr>
+              <w:t>1.05B on ClimbMix to 6B tokens</w:t>
+            </w:r>
+          </w:p>
+        </w:tc>
+        <w:tc>
+          <w:tcPr>
+            <w:tcW w:type="dxa" w:w="1701"/>
+          </w:tcPr>
+          <w:p>
+            <w:r>
+              <w:rPr>
+                <w:sz w:val="20"/>
+              </w:rPr>
+              <w:t>~$1,800</w:t>
+            </w:r>
+          </w:p>
+        </w:tc>
+      </w:tr>
+      <w:tr>
+        <w:tc>
+          <w:tcPr>
+            <w:tcW w:type="dxa" w:w="1984"/>
+          </w:tcPr>
+          <w:p>
+            <w:r>
+              <w:rPr>
+                <w:sz w:val="20"/>
+              </w:rPr>
+              <w:t>B. Code-heavy SFT</w:t>
+            </w:r>
+          </w:p>
+        </w:tc>
+        <w:tc>
+          <w:tcPr>
+            <w:tcW w:type="dxa" w:w="1984"/>
+          </w:tcPr>
+          <w:p>
+            <w:r>
+              <w:rPr>
+                <w:sz w:val="20"/>
+              </w:rPr>
+              <w:t>config ready</w:t>
+            </w:r>
+          </w:p>
+        </w:tc>
+        <w:tc>
+          <w:tcPr>
+            <w:tcW w:type="dxa" w:w="3402"/>
+          </w:tcPr>
+          <w:p>
+            <w:r>
+              <w:rPr>
+                <w:sz w:val="20"/>
+              </w:rPr>
+              <w:t>SFT on 35-40%-code mixture, 4000 steps</w:t>
+            </w:r>
+          </w:p>
+        </w:tc>
+        <w:tc>
+          <w:tcPr>
+            <w:tcW w:type="dxa" w:w="1701"/>
+          </w:tcPr>
+          <w:p>
+            <w:r>
+              <w:rPr>
+                <w:sz w:val="20"/>
+              </w:rPr>
+              <w:t>~$340</w:t>
+            </w:r>
+          </w:p>
+        </w:tc>
+      </w:tr>
+      <w:tr>
+        <w:tc>
+          <w:tcPr>
+            <w:tcW w:type="dxa" w:w="1984"/>
+          </w:tcPr>
+          <w:p>
+            <w:r>
+              <w:rPr>
+                <w:sz w:val="20"/>
+              </w:rPr>
+              <w:t>B-end eval</w:t>
+            </w:r>
+          </w:p>
+        </w:tc>
+        <w:tc>
+          <w:tcPr>
+            <w:tcW w:type="dxa" w:w="1984"/>
+          </w:tcPr>
+          <w:p>
+            <w:r>
+              <w:rPr>
+                <w:sz w:val="20"/>
+              </w:rPr>
+              <w:t>manual</w:t>
+            </w:r>
+          </w:p>
+        </w:tc>
+        <w:tc>
+          <w:tcPr>
+            <w:tcW w:type="dxa" w:w="3402"/>
+          </w:tcPr>
+          <w:p>
+            <w:r>
+              <w:rPr>
+                <w:sz w:val="20"/>
+              </w:rPr>
+              <w:t>Full HumanEval (164 q) + MBPP (257 q sanitized) at depths [1,2,4,8] via run/evaluate_checkpoint.sh</w:t>
+            </w:r>
+          </w:p>
+        </w:tc>
+        <w:tc>
+          <w:tcPr>
+            <w:tcW w:type="dxa" w:w="1701"/>
+          </w:tcPr>
+          <w:p>
+            <w:r>
+              <w:rPr>
+                <w:sz w:val="20"/>
+              </w:rPr>
+              <w:t>~$50</w:t>
+            </w:r>
+          </w:p>
+        </w:tc>
+      </w:tr>
+      <w:tr>
+        <w:tc>
+          <w:tcPr>
+            <w:tcW w:type="dxa" w:w="1984"/>
+          </w:tcPr>
+          <w:p>
+            <w:r>
+              <w:rPr>
+                <w:sz w:val="20"/>
+              </w:rPr>
+              <w:t>C. Future</w:t>
+            </w:r>
+          </w:p>
+        </w:tc>
+        <w:tc>
+          <w:tcPr>
+            <w:tcW w:type="dxa" w:w="1984"/>
+          </w:tcPr>
+          <w:p>
+            <w:r>
+              <w:rPr>
+                <w:sz w:val="20"/>
+              </w:rPr>
+              <w:t>not in this budget</w:t>
+            </w:r>
+          </w:p>
+        </w:tc>
+        <w:tc>
+          <w:tcPr>
+            <w:tcW w:type="dxa" w:w="3402"/>
+          </w:tcPr>
+          <w:p>
+            <w:r>
+              <w:rPr>
+                <w:sz w:val="20"/>
+              </w:rPr>
+              <w:t>FlashAttention surgery in EBT; retrain with full S2 recipe</w:t>
+            </w:r>
+          </w:p>
+        </w:tc>
+        <w:tc>
+          <w:tcPr>
+            <w:tcW w:type="dxa" w:w="1701"/>
+          </w:tcPr>
+          <w:p>
+            <w:r>
+              <w:rPr>
+                <w:sz w:val="20"/>
+              </w:rPr>
+              <w:t>separate budget</w:t>
+            </w:r>
+          </w:p>
+        </w:tc>
+      </w:tr>
+    </w:tbl>
+    <w:p>
+      <w:pPr>
+        <w:pStyle w:val="Heading2"/>
+      </w:pPr>
+      <w:r>
+        <w:rPr>
+          <w:color w:val="1F2A44"/>
+        </w:rPr>
+        <w:t>14.8 Success Criteria for Run 5</w:t>
+      </w:r>
+    </w:p>
+    <w:p>
+      <w:pPr>
+        <w:pStyle w:val="ListBullet"/>
+      </w:pPr>
+      <w:r>
+        <w:t>MBPP pass@1 &gt;= 10% after SFT (the headline goal)</w:t>
+      </w:r>
+    </w:p>
+    <w:p>
+      <w:pPr>
+        <w:pStyle w:val="ListBullet"/>
+      </w:pPr>
+      <w:r>
+        <w:t>HumanEval pass@1 &gt;= 2% after SFT (bonus, not required)</w:t>
+      </w:r>
+    </w:p>
+    <w:p>
+      <w:pPr>
+        <w:pStyle w:val="ListBullet"/>
+      </w:pPr>
+      <w:r>
+        <w:t>CORE_metric &gt;= 0.10 after pretraining (sanity that the LM is learning)</w:t>
+      </w:r>
+    </w:p>
+    <w:p>
+      <w:pPr>
+        <w:pStyle w:val="ListBullet"/>
+      </w:pPr>
+      <w:r>
+        <w:t>Energy gap stays positive throughout pretraining (sanity that the EBT mechanic is functioning, even if it does not grow like the paper predicts with full S2)</w:t>
+      </w:r>
+    </w:p>
+    <w:p>
+      <w:pPr>
+        <w:pStyle w:val="ListBullet"/>
+      </w:pPr>
+      <w:r>
+        <w:t>Run completes within $2.5K total spend</w:t>
+      </w:r>
+    </w:p>
+    <w:p>
+      <w:pPr>
+        <w:pStyle w:val="Heading2"/>
+      </w:pPr>
+      <w:r>
+        <w:rPr>
+          <w:color w:val="1F2A44"/>
+        </w:rPr>
+        <w:t>14.9 Files Touched in This Round (Commit 4890dc6)</w:t>
+      </w:r>
+    </w:p>
+    <w:p>
+      <w:pPr>
+        <w:pStyle w:val="ListBullet"/>
+      </w:pPr>
+      <w:r>
+        <w:t>configs/ebt_1b_climbmix_4xb200.json - NEW</w:t>
+      </w:r>
+    </w:p>
+    <w:p>
+      <w:pPr>
+        <w:pStyle w:val="ListBullet"/>
+      </w:pPr>
+      <w:r>
+        <w:t>run/train_1b_4xb200.sh - NEW</w:t>
+      </w:r>
+    </w:p>
+    <w:p>
+      <w:pPr>
+        <w:pStyle w:val="ListBullet"/>
+      </w:pPr>
+      <w:r>
+        <w:t>run/train_sft_1b_4xb200.sh - NEW</w:t>
+      </w:r>
+    </w:p>
+    <w:p>
+      <w:pPr>
+        <w:pStyle w:val="ListBullet"/>
+      </w:pPr>
+      <w:r>
+        <w:t>src/energy_coding/evaluation.py - + evaluate_mbpp, _build_mbpp_prompt, _build_mbpp_program; _generate_one now takes max_new_tokens param</w:t>
+      </w:r>
+    </w:p>
+    <w:p>
+      <w:pPr>
+        <w:pStyle w:val="ListBullet"/>
+      </w:pPr>
+      <w:r>
+        <w:t>src/energy_coding/config.py - + mbpp_interval, mbpp_max_problems, mbpp_max_new_tokens, mbpp_self_verify_samples</w:t>
+      </w:r>
+    </w:p>
+    <w:p>
+      <w:pPr>
+        <w:pStyle w:val="ListBullet"/>
+      </w:pPr>
+      <w:r>
+        <w:t>scripts/train_1b.py - + should_mbpp branch, MBPP eval call, W&amp;B log</w:t>
+      </w:r>
+    </w:p>
+    <w:p>
+      <w:pPr>
+        <w:pStyle w:val="ListBullet"/>
+      </w:pPr>
+      <w:r>
+        <w:t>src/energy_coding/data.py - code-heavy SFT mixture defaults</w:t>
       </w:r>
     </w:p>
     <w:sectPr>

</xml_diff>